<commit_message>
docs: update IT hosting doc for GEE decision (processing offloaded, server stays light)
Reflect the decision that all satellite/spatial processing runs in Google Earth
Engine, not on CIFOR-ICRAF. Hosting is still all in-house (web + PostGIS + archives),
but GEE is now a named free external compute service that stores none of our data;
the server drops to a light role (site + DB + archives + a small scheduled GEE
trigger), so the spec eases to ~2-4 vCPU. Section C becomes a confirmed GEE account
ask with a data note (only public analysis and user-drawn AOIs transit GEE, never
private layers). Regenerate the shareable Word document to match.

Co-Authored-By: Claude Opus 4.8 <noreply@anthropic.com>
Claude-Session: https://claude.ai/code/session_01JjCaH5QVEQj3kxEsi44mEx
</commit_message>
<xml_diff>
--- a/docs/OrO-Portal-Hosting-Requirements.docx
+++ b/docs/OrO-Portal-Hosting-Requirements.docx
@@ -42,7 +42,7 @@
           <w:sz w:val="20"/>
           <w:szCs w:val="20"/>
         </w:rPr>
-        <w:t xml:space="preserve">Fully in-house model — all hosting by CIFOR-ICRAF</w:t>
+        <w:t xml:space="preserve">Hosting in-house on CIFOR-ICRAF · satellite analysis via Google Earth Engine</w:t>
       </w:r>
     </w:p>
     <w:p>
@@ -83,6 +83,35 @@
     </w:p>
     <w:p>
       <w:pPr>
+        <w:pBdr>
+          <w:left w:val="single" w:color="1F3A5F" w:sz="18" w:space="12"/>
+        </w:pBdr>
+        <w:spacing w:after="220"/>
+        <w:ind w:left="240"/>
+      </w:pPr>
+      <w:r>
+        <w:rPr>
+          <w:b/>
+          <w:bCs/>
+        </w:rPr>
+        <w:t xml:space="preserve">Hosting model:  </w:t>
+      </w:r>
+      <w:r>
+        <w:t xml:space="preserve">all hosting is provided by CIFOR-ICRAF — no commercial cloud, everything on institutional infrastructure and under institutional control. The one external service is </w:t>
+      </w:r>
+      <w:r>
+        <w:rPr>
+          <w:b/>
+          <w:bCs/>
+        </w:rPr>
+        <w:t xml:space="preserve">Google Earth Engine (GEE)</w:t>
+      </w:r>
+      <w:r>
+        <w:t xml:space="preserve">, used purely as a free compute service for satellite/spatial analysis — it stores none of our data. Sensitive layers never leave CIFOR-ICRAF.</w:t>
+      </w:r>
+    </w:p>
+    <w:p>
+      <w:pPr>
         <w:pStyle w:val="Heading1"/>
         <w:spacing w:before="240" w:after="120"/>
       </w:pPr>
@@ -119,7 +148,7 @@
           <w:i/>
           <w:iCs/>
         </w:rPr>
-        <w:t xml:space="preserve">. The entire ask is one modest Linux server (or VM) with a database, plus a public web address and outbound internet access so it can read free satellite data. There are </w:t>
+        <w:t xml:space="preserve">. Heavy satellite analysis is offloaded to </w:t>
       </w:r>
       <w:r>
         <w:rPr>
@@ -128,7 +157,23 @@
           <w:i/>
           <w:iCs/>
         </w:rPr>
-        <w:t xml:space="preserve">no external hosting requirements and no recurring cloud costs.</w:t>
+        <w:t xml:space="preserve">Google Earth Engine</w:t>
+      </w:r>
+      <w:r>
+        <w:rPr>
+          <w:i/>
+          <w:iCs/>
+        </w:rPr>
+        <w:t xml:space="preserve">, a free external compute service that stores none of our data. The entire ask is one modest Linux server with a database, a public web address, outbound internet, and a Google Earth Engine account. </w:t>
+      </w:r>
+      <w:r>
+        <w:rPr>
+          <w:b/>
+          <w:bCs/>
+          <w:i/>
+          <w:iCs/>
+        </w:rPr>
+        <w:t xml:space="preserve">No commercial cloud and no recurring cloud costs.</w:t>
       </w:r>
     </w:p>
     <w:p>
@@ -137,7 +182,7 @@
         <w:spacing w:before="240" w:after="120"/>
       </w:pPr>
       <w:r>
-        <w:t xml:space="preserve">What runs where — all in-house</w:t>
+        <w:t xml:space="preserve">What runs where</w:t>
       </w:r>
     </w:p>
     <w:tbl>
@@ -412,7 +457,7 @@
                 <w:sz w:val="19"/>
                 <w:szCs w:val="19"/>
               </w:rPr>
-              <w:t xml:space="preserve">Scheduled processing &amp; reporting</w:t>
+              <w:t xml:space="preserve">Document archives (OCR + reader)</w:t>
             </w:r>
           </w:p>
         </w:tc>
@@ -437,7 +482,7 @@
                 <w:sz w:val="19"/>
                 <w:szCs w:val="19"/>
               </w:rPr>
-              <w:t xml:space="preserve">CIFOR-ICRAF server</w:t>
+              <w:t xml:space="preserve">CIFOR-ICRAF server + storage</w:t>
             </w:r>
           </w:p>
         </w:tc>
@@ -460,7 +505,7 @@
                 <w:sz w:val="19"/>
                 <w:szCs w:val="19"/>
               </w:rPr>
-              <w:t xml:space="preserve">Python job on server cron; no always-on load</w:t>
+              <w:t xml:space="preserve">Search index and scanned originals stay in-house</w:t>
             </w:r>
           </w:p>
         </w:tc>
@@ -486,7 +531,7 @@
                 <w:sz w:val="19"/>
                 <w:szCs w:val="19"/>
               </w:rPr>
-              <w:t xml:space="preserve">Document archives (OCR + reader)</w:t>
+              <w:t xml:space="preserve">Satellite / spatial analysis + site tool</w:t>
             </w:r>
           </w:p>
         </w:tc>
@@ -509,10 +554,11 @@
               <w:rPr>
                 <w:b/>
                 <w:bCs/>
-                <w:sz w:val="19"/>
-                <w:szCs w:val="19"/>
-              </w:rPr>
-              <w:t xml:space="preserve">CIFOR-ICRAF server + storage</w:t>
+                <w:color w:val="2E6B3E"/>
+                <w:sz w:val="19"/>
+                <w:szCs w:val="19"/>
+              </w:rPr>
+              <w:t xml:space="preserve">Google Earth Engine</w:t>
             </w:r>
           </w:p>
         </w:tc>
@@ -536,7 +582,7 @@
                 <w:sz w:val="19"/>
                 <w:szCs w:val="19"/>
               </w:rPr>
-              <w:t xml:space="preserve">Search index and scanned originals stay in-house</w:t>
+              <w:t xml:space="preserve">Free external compute; results returned, nothing of ours stored there</w:t>
             </w:r>
           </w:p>
         </w:tc>
@@ -561,6 +607,80 @@
                 <w:sz w:val="19"/>
                 <w:szCs w:val="19"/>
               </w:rPr>
+              <w:t xml:space="preserve">Scheduled reporting trigger</w:t>
+            </w:r>
+          </w:p>
+        </w:tc>
+        <w:tc>
+          <w:tcPr>
+            <w:tcW w:type="dxa" w:w="2360"/>
+            <w:tcMar>
+              <w:top w:type="dxa" w:w="60"/>
+              <w:left w:type="dxa" w:w="90"/>
+              <w:bottom w:type="dxa" w:w="60"/>
+              <w:right w:type="dxa" w:w="90"/>
+            </w:tcMar>
+          </w:tcPr>
+          <w:p>
+            <w:pPr>
+              <w:spacing w:after="0"/>
+            </w:pPr>
+            <w:r>
+              <w:rPr>
+                <w:b/>
+                <w:bCs/>
+                <w:sz w:val="19"/>
+                <w:szCs w:val="19"/>
+              </w:rPr>
+              <w:t xml:space="preserve">CIFOR-ICRAF server</w:t>
+            </w:r>
+          </w:p>
+        </w:tc>
+        <w:tc>
+          <w:tcPr>
+            <w:tcW w:type="dxa" w:w="3950"/>
+            <w:tcMar>
+              <w:top w:type="dxa" w:w="60"/>
+              <w:left w:type="dxa" w:w="90"/>
+              <w:bottom w:type="dxa" w:w="60"/>
+              <w:right w:type="dxa" w:w="90"/>
+            </w:tcMar>
+          </w:tcPr>
+          <w:p>
+            <w:pPr>
+              <w:spacing w:after="0"/>
+            </w:pPr>
+            <w:r>
+              <w:rPr>
+                <w:sz w:val="19"/>
+                <w:szCs w:val="19"/>
+              </w:rPr>
+              <w:t xml:space="preserve">Light cron job calls GEE, writes results to DB, emails digest</w:t>
+            </w:r>
+          </w:p>
+        </w:tc>
+      </w:tr>
+      <w:tr>
+        <w:tc>
+          <w:tcPr>
+            <w:tcW w:type="dxa" w:w="3050"/>
+            <w:shd w:fill="EEF2F6" w:color="auto" w:val="clear"/>
+            <w:tcMar>
+              <w:top w:type="dxa" w:w="60"/>
+              <w:left w:type="dxa" w:w="90"/>
+              <w:bottom w:type="dxa" w:w="60"/>
+              <w:right w:type="dxa" w:w="90"/>
+            </w:tcMar>
+          </w:tcPr>
+          <w:p>
+            <w:pPr>
+              <w:spacing w:after="0"/>
+            </w:pPr>
+            <w:r>
+              <w:rPr>
+                <w:sz w:val="19"/>
+                <w:szCs w:val="19"/>
+              </w:rPr>
               <w:t xml:space="preserve">Satellite / deforestation source data</w:t>
             </w:r>
           </w:p>
@@ -568,6 +688,7 @@
         <w:tc>
           <w:tcPr>
             <w:tcW w:type="dxa" w:w="2360"/>
+            <w:shd w:fill="EEF2F6" w:color="auto" w:val="clear"/>
             <w:tcMar>
               <w:top w:type="dxa" w:w="60"/>
               <w:left w:type="dxa" w:w="90"/>
@@ -591,6 +712,7 @@
         <w:tc>
           <w:tcPr>
             <w:tcW w:type="dxa" w:w="3950"/>
+            <w:shd w:fill="EEF2F6" w:color="auto" w:val="clear"/>
             <w:tcMar>
               <w:top w:type="dxa" w:w="60"/>
               <w:left w:type="dxa" w:w="90"/>
@@ -618,17 +740,17 @@
         <w:spacing w:before="120" w:after="200"/>
       </w:pPr>
       <w:r>
-        <w:t xml:space="preserve">Everything the project controls is hosted by CIFOR-ICRAF. The only thing that comes from outside is the raw satellite imagery itself, which is </w:t>
-      </w:r>
-      <w:r>
-        <w:rPr>
-          <w:b/>
-          <w:bCs/>
-        </w:rPr>
-        <w:t xml:space="preserve">downloaded</w:t>
-      </w:r>
-      <w:r>
-        <w:t xml:space="preserve"> from free public providers — it needs no hosting, no contract and, for the core feeds, no account.</w:t>
+        <w:t xml:space="preserve">The data CIFOR-ICRAF holds (private database + document archives) stays entirely in-house. Google Earth Engine does the number-crunching on </w:t>
+      </w:r>
+      <w:r>
+        <w:rPr>
+          <w:b/>
+          <w:bCs/>
+        </w:rPr>
+        <w:t xml:space="preserve">public</w:t>
+      </w:r>
+      <w:r>
+        <w:t xml:space="preserve"> satellite data and returns results; it is a compute service we send jobs to, not a place our data lives.</w:t>
       </w:r>
     </w:p>
     <w:p>
@@ -646,7 +768,20 @@
         <w:spacing w:before="240" w:after="120"/>
       </w:pPr>
       <w:r>
-        <w:t xml:space="preserve">A.  One Linux server (or VM) that hosts the whole portal</w:t>
+        <w:t xml:space="preserve">A.  One Linux server (or VM) that hosts the portal</w:t>
+      </w:r>
+    </w:p>
+    <w:p>
+      <w:pPr>
+        <w:spacing w:after="120"/>
+      </w:pPr>
+      <w:r>
+        <w:rPr>
+          <w:i/>
+          <w:iCs/>
+          <w:color w:val="5A5A5A"/>
+        </w:rPr>
+        <w:t xml:space="preserve">Heavy processing is offloaded to Google Earth Engine, so the server stays light — it runs the website, the database, the archives, and a small scheduled job.</w:t>
       </w:r>
     </w:p>
     <w:p>
@@ -686,7 +821,7 @@
         <w:t xml:space="preserve">Size: </w:t>
       </w:r>
       <w:r>
-        <w:t xml:space="preserve">~4 vCPU, 8 GB RAM, 100+ GB disk to start (disk grows with the scanned archive; all figures easily scaled later)</w:t>
+        <w:t xml:space="preserve">~2–4 vCPU, 8 GB RAM, 100+ GB disk to start (disk grows with the scanned archive; all figures easily scaled later)</w:t>
       </w:r>
     </w:p>
     <w:p>
@@ -706,7 +841,7 @@
         <w:t xml:space="preserve">Software: </w:t>
       </w:r>
       <w:r>
-        <w:t xml:space="preserve">a web server (nginx / Apache) for the static site; PostgreSQL with the PostGIS extension; Python 3; Docker helpful but not required</w:t>
+        <w:t xml:space="preserve">a web server (nginx / Apache); PostgreSQL with the PostGIS extension; Python 3 (for the GEE trigger + report generation); Docker helpful but not required</w:t>
       </w:r>
     </w:p>
     <w:p>
@@ -726,7 +861,7 @@
         <w:t xml:space="preserve">Scheduling: </w:t>
       </w:r>
       <w:r>
-        <w:t xml:space="preserve">server cron (or systemd timers) to run the reporting job on a schedule</w:t>
+        <w:t xml:space="preserve">server cron (or systemd timers) to run the reporting trigger on a schedule</w:t>
       </w:r>
     </w:p>
     <w:p>
@@ -766,7 +901,7 @@
         <w:t xml:space="preserve">Outbound internet (HTTPS): </w:t>
       </w:r>
       <w:r>
-        <w:t xml:space="preserve">so the server can pull free satellite data feeds</w:t>
+        <w:t xml:space="preserve">to reach Google Earth Engine and free tile / data feeds</w:t>
       </w:r>
     </w:p>
     <w:p>
@@ -819,7 +954,7 @@
           <w:iCs/>
           <w:color w:val="5A5A5A"/>
         </w:rPr>
-        <w:t xml:space="preserve">A single machine covers all five components above. It can later be split (web server separate from database) if load ever requires it, but that is not needed to start.</w:t>
+        <w:t xml:space="preserve">A single machine covers all of the above. It can later be split (web server separate from database) if load ever requires it, but that is not needed to start.</w:t>
       </w:r>
     </w:p>
     <w:p>
@@ -1227,7 +1362,7 @@
         <w:spacing w:before="240" w:after="120"/>
       </w:pPr>
       <w:r>
-        <w:t xml:space="preserve">C.  Satellite processing — one decision for IT to note</w:t>
+        <w:t xml:space="preserve">C.  Google Earth Engine account (confirmed)</w:t>
       </w:r>
     </w:p>
     <w:p>
@@ -1235,7 +1370,17 @@
         <w:spacing w:after="120"/>
       </w:pPr>
       <w:r>
-        <w:t xml:space="preserve">The heavy satellite analysis can be done either way; either keeps hosting in-house:</w:t>
+        <w:t xml:space="preserve">Satellite and site analysis run in </w:t>
+      </w:r>
+      <w:r>
+        <w:rPr>
+          <w:b/>
+          <w:bCs/>
+        </w:rPr>
+        <w:t xml:space="preserve">Google Earth Engine</w:t>
+      </w:r>
+      <w:r>
+        <w:t xml:space="preserve"> — this is decided. GEE is free for research / non-commercial use and hosts none of our data.</w:t>
       </w:r>
     </w:p>
     <w:p>
@@ -1252,10 +1397,10 @@
           <w:b/>
           <w:bCs/>
         </w:rPr>
-        <w:t xml:space="preserve">Preferred (simplest): </w:t>
-      </w:r>
-      <w:r>
-        <w:t xml:space="preserve">use a free Google Earth Engine research account to run the analysis and pull back only the results. Earth Engine is an external compute service we send jobs to — it hosts nothing of ours and costs nothing. If CIFOR-ICRAF already holds an Earth Engine credential, we can use it.</w:t>
+        <w:t xml:space="preserve">Ask: </w:t>
+      </w:r>
+      <w:r>
+        <w:t xml:space="preserve">does CIFOR-ICRAF already hold an Earth Engine account / service credential we can use? If not, we register one (free).</w:t>
       </w:r>
     </w:p>
     <w:p>
@@ -1272,23 +1417,10 @@
           <w:b/>
           <w:bCs/>
         </w:rPr>
-        <w:t xml:space="preserve">Fully self-contained alternative: </w:t>
-      </w:r>
-      <w:r>
-        <w:t xml:space="preserve">if IT prefers zero external services, the same analysis can run on the CIFOR-ICRAF server with open-source tools (GDAL / rasterio / Sentinel downloads). This needs a little more disk and CPU but removes the last outside dependency entirely.</w:t>
-      </w:r>
-    </w:p>
-    <w:p>
-      <w:pPr>
-        <w:spacing w:after="120"/>
-      </w:pPr>
-      <w:r>
-        <w:rPr>
-          <w:i/>
-          <w:iCs/>
-          <w:color w:val="5A5A5A"/>
-        </w:rPr>
-        <w:t xml:space="preserve">Flag which of these CIFOR-ICRAF prefers — it is the only open choice in this setup.</w:t>
+        <w:t xml:space="preserve">Data note for IT: </w:t>
+      </w:r>
+      <w:r>
+        <w:t xml:space="preserve">only public satellite analysis and any user-drawn area of interest (from the site-analysis tool) are sent to GEE — transiently, for computation, and not stored. Private / sensitive layers (tenure, community boundaries, partner data, precise biodiversity) are never sent to GEE; they stay in the in-house database.</w:t>
       </w:r>
     </w:p>
     <w:p>
@@ -1317,7 +1449,7 @@
         <w:t xml:space="preserve">Email sending: </w:t>
       </w:r>
       <w:r>
-        <w:t xml:space="preserve">the reporting job sends periodic email digests. Can it relay through an institutional SMTP server? (Keeps mail in-house too.)</w:t>
+        <w:t xml:space="preserve">the scheduled reporting job and the site-analysis tool send email (report digests, and user site reports on request). Can these relay through an institutional SMTP server? (Keeps mail in-house too.)</w:t>
       </w:r>
     </w:p>
     <w:p>
@@ -1359,17 +1491,14 @@
         <w:spacing w:after="60"/>
       </w:pPr>
       <w:r>
-        <w:t xml:space="preserve">Only possible small item: a </w:t>
-      </w:r>
-      <w:r>
-        <w:rPr>
-          <w:b/>
-          <w:bCs/>
-        </w:rPr>
-        <w:t xml:space="preserve">custom domain name</w:t>
-      </w:r>
-      <w:r>
-        <w:t xml:space="preserve"> (~US$10–15/yr) if a suitable CIFOR-ICRAF domain isn't used.</w:t>
+        <w:rPr>
+          <w:b/>
+          <w:bCs/>
+        </w:rPr>
+        <w:t xml:space="preserve">Google Earth Engine is free </w:t>
+      </w:r>
+      <w:r>
+        <w:t xml:space="preserve">for research / non-commercial use.</w:t>
       </w:r>
     </w:p>
     <w:p>
@@ -1382,16 +1511,17 @@
         <w:spacing w:after="60"/>
       </w:pPr>
       <w:r>
-        <w:t xml:space="preserve">Core satellite feeds are free; the standard Planet NICFI programme tier is free for this use.</w:t>
-      </w:r>
-    </w:p>
-    <w:p>
-      <w:pPr>
-        <w:pStyle w:val="Heading1"/>
-        <w:spacing w:before="240" w:after="120"/>
-      </w:pPr>
-      <w:r>
-        <w:t xml:space="preserve">What this model gives you</w:t>
+        <w:t xml:space="preserve">Only possible small item: a </w:t>
+      </w:r>
+      <w:r>
+        <w:rPr>
+          <w:b/>
+          <w:bCs/>
+        </w:rPr>
+        <w:t xml:space="preserve">custom domain name</w:t>
+      </w:r>
+      <w:r>
+        <w:t xml:space="preserve"> (~US$10–15/yr) if a suitable CIFOR-ICRAF domain isn't used.</w:t>
       </w:r>
     </w:p>
     <w:p>
@@ -1404,14 +1534,16 @@
         <w:spacing w:after="60"/>
       </w:pPr>
       <w:r>
-        <w:rPr>
-          <w:b/>
-          <w:bCs/>
-        </w:rPr>
-        <w:t xml:space="preserve">Full data sovereignty </w:t>
-      </w:r>
-      <w:r>
-        <w:t xml:space="preserve">— every layer, document and log stays on institutional infrastructure; nothing sensitive leaves CIFOR-ICRAF control.</w:t>
+        <w:t xml:space="preserve">Core satellite feeds are free; the standard Planet NICFI programme tier is free for this use.</w:t>
+      </w:r>
+    </w:p>
+    <w:p>
+      <w:pPr>
+        <w:pStyle w:val="Heading1"/>
+        <w:spacing w:before="240" w:after="120"/>
+      </w:pPr>
+      <w:r>
+        <w:t xml:space="preserve">What this model gives you</w:t>
       </w:r>
     </w:p>
     <w:p>
@@ -1428,10 +1560,10 @@
           <w:b/>
           <w:bCs/>
         </w:rPr>
-        <w:t xml:space="preserve">No third-party accounts or contracts </w:t>
-      </w:r>
-      <w:r>
-        <w:t xml:space="preserve">for hosting.</w:t>
+        <w:t xml:space="preserve">Data sovereignty where it matters </w:t>
+      </w:r>
+      <w:r>
+        <w:t xml:space="preserve">— every private layer, document and log stays on institutional infrastructure. Only public satellite analysis and user-drawn areas of interest transit Google Earth Engine, transiently, with nothing of ours stored there.</w:t>
       </w:r>
     </w:p>
     <w:p>
@@ -1448,10 +1580,30 @@
           <w:b/>
           <w:bCs/>
         </w:rPr>
+        <w:t xml:space="preserve">No commercial cloud </w:t>
+      </w:r>
+      <w:r>
+        <w:t xml:space="preserve">and no per-service subscriptions.</w:t>
+      </w:r>
+    </w:p>
+    <w:p>
+      <w:pPr>
+        <w:pStyle w:val="ListParagraph"/>
+        <w:numPr>
+          <w:ilvl w:val="0"/>
+          <w:numId w:val="1"/>
+        </w:numPr>
+        <w:spacing w:after="60"/>
+      </w:pPr>
+      <w:r>
+        <w:rPr>
+          <w:b/>
+          <w:bCs/>
+        </w:rPr>
         <w:t xml:space="preserve">A single, well-understood machine </w:t>
       </w:r>
       <w:r>
-        <w:t xml:space="preserve">to provision, back up and patch.</w:t>
+        <w:t xml:space="preserve">to provision, back up and patch — kept light because heavy compute is offloaded to GEE.</w:t>
       </w:r>
     </w:p>
     <w:p>
@@ -1492,7 +1644,7 @@
         <w:t xml:space="preserve">SO1 1.1 1.1-4 Develop data sharing portals</w:t>
       </w:r>
       <w:r>
-        <w:t xml:space="preserve"> — Entire portal (public site, PostGIS database, scheduled reporting and document archive) hosted in-house on one CIFOR-ICRAF Linux server; no external hosting and no recurring cloud costs.</w:t>
+        <w:t xml:space="preserve"> — Portal (public site, PostGIS database, scheduled reporting and document archive) hosted in-house on one CIFOR-ICRAF Linux server, with satellite analysis via Google Earth Engine (free external compute, no data stored there); no commercial cloud and no recurring cloud costs.</w:t>
       </w:r>
     </w:p>
     <w:sectPr>

</xml_diff>